<commit_message>
update on 2025-12-28 21:11:22.934856
</commit_message>
<xml_diff>
--- a/py - torch.docx
+++ b/py - torch.docx
@@ -445,12 +445,6 @@
             <w:insideH w:val="single" w:color="auto" w:sz="4" w:space="0"/>
             <w:insideV w:val="single" w:color="auto" w:sz="4" w:space="0"/>
           </w:tblBorders>
-          <w:tblCellMar>
-            <w:top w:w="0" w:type="dxa"/>
-            <w:left w:w="108" w:type="dxa"/>
-            <w:bottom w:w="0" w:type="dxa"/>
-            <w:right w:w="108" w:type="dxa"/>
-          </w:tblCellMar>
         </w:tblPrEx>
         <w:tc>
           <w:tcPr>
@@ -7305,7 +7299,6 @@
           <w:tcPr>
             <w:tcW w:w="0" w:type="auto"/>
             <w:vMerge w:val="continue"/>
-            <w:tcBorders/>
             <w:vAlign w:val="center"/>
           </w:tcPr>
           <w:p>
@@ -7405,7 +7398,6 @@
           <w:tcPr>
             <w:tcW w:w="0" w:type="auto"/>
             <w:vMerge w:val="continue"/>
-            <w:tcBorders/>
             <w:vAlign w:val="center"/>
           </w:tcPr>
           <w:p>
@@ -7511,7 +7503,6 @@
           <w:tcPr>
             <w:tcW w:w="0" w:type="auto"/>
             <w:vMerge w:val="continue"/>
-            <w:tcBorders/>
             <w:vAlign w:val="center"/>
           </w:tcPr>
           <w:p>
@@ -26883,6 +26874,71 @@
           <w:rFonts w:hint="eastAsia"/>
         </w:rPr>
       </w:pPr>
+      <w:r>
+        <w:rPr>
+          <w:rFonts w:hint="eastAsia"/>
+          <w:lang w:eastAsia="zh-CN"/>
+        </w:rPr>
+        <w:t>图</w:t>
+      </w:r>
+      <w:r>
+        <w:rPr>
+          <w:rFonts w:hint="eastAsia"/>
+        </w:rPr>
+        <w:t>torch</w:t>
+      </w:r>
+      <w:r>
+        <w:rPr>
+          <w:rFonts w:hint="eastAsia"/>
+          <w:lang w:val="en-US" w:eastAsia="zh-CN"/>
+        </w:rPr>
+        <w:t>_geometric</w:t>
+      </w:r>
+      <w:bookmarkStart w:id="28" w:name="_GoBack"/>
+      <w:bookmarkEnd w:id="28"/>
+      <w:r>
+        <w:rPr>
+          <w:rFonts w:hint="eastAsia"/>
+        </w:rPr>
+        <w:t>：</w:t>
+      </w:r>
+    </w:p>
+    <w:p>
+      <w:pPr>
+        <w:rPr>
+          <w:color w:val="00B0F0"/>
+        </w:rPr>
+      </w:pPr>
+    </w:p>
+    <w:p>
+      <w:pPr>
+        <w:rPr>
+          <w:color w:val="00B0F0"/>
+        </w:rPr>
+      </w:pPr>
+    </w:p>
+    <w:p>
+      <w:pPr>
+        <w:rPr>
+          <w:color w:val="00B0F0"/>
+        </w:rPr>
+      </w:pPr>
+    </w:p>
+    <w:p>
+      <w:pPr>
+        <w:rPr>
+          <w:color w:val="00B0F0"/>
+        </w:rPr>
+      </w:pPr>
+    </w:p>
+    <w:p>
+      <w:pPr>
+        <w:pStyle w:val="17"/>
+        <w:bidi w:val="0"/>
+        <w:rPr>
+          <w:rFonts w:hint="eastAsia"/>
+        </w:rPr>
+      </w:pPr>
       <w:bookmarkStart w:id="13" w:name="_Toc16320"/>
       <w:r>
         <w:rPr>
@@ -31554,6 +31610,12 @@
             <w:insideH w:val="single" w:color="auto" w:sz="4" w:space="0"/>
             <w:insideV w:val="single" w:color="auto" w:sz="4" w:space="0"/>
           </w:tblBorders>
+          <w:tblCellMar>
+            <w:top w:w="0" w:type="dxa"/>
+            <w:left w:w="108" w:type="dxa"/>
+            <w:bottom w:w="0" w:type="dxa"/>
+            <w:right w:w="108" w:type="dxa"/>
+          </w:tblCellMar>
         </w:tblPrEx>
         <w:tc>
           <w:tcPr>
@@ -32039,6 +32101,12 @@
             <w:insideH w:val="single" w:color="auto" w:sz="4" w:space="0"/>
             <w:insideV w:val="single" w:color="auto" w:sz="4" w:space="0"/>
           </w:tblBorders>
+          <w:tblCellMar>
+            <w:top w:w="0" w:type="dxa"/>
+            <w:left w:w="108" w:type="dxa"/>
+            <w:bottom w:w="0" w:type="dxa"/>
+            <w:right w:w="108" w:type="dxa"/>
+          </w:tblCellMar>
         </w:tblPrEx>
         <w:tc>
           <w:tcPr>
@@ -36199,8 +36267,6 @@
           <w:lang w:val="en-US" w:eastAsia="zh-CN" w:bidi="ar-SA"/>
         </w:rPr>
       </w:pPr>
-      <w:bookmarkStart w:id="28" w:name="_GoBack"/>
-      <w:bookmarkEnd w:id="28"/>
       <w:r>
         <w:rPr>
           <w:rFonts w:hint="eastAsia" w:ascii="华文中宋" w:hAnsi="华文中宋" w:eastAsia="华文中宋" w:cs="华文中宋"/>
@@ -38174,6 +38240,12 @@
             <w:insideH w:val="single" w:color="auto" w:sz="4" w:space="0"/>
             <w:insideV w:val="single" w:color="auto" w:sz="4" w:space="0"/>
           </w:tblBorders>
+          <w:tblCellMar>
+            <w:top w:w="0" w:type="dxa"/>
+            <w:left w:w="108" w:type="dxa"/>
+            <w:bottom w:w="0" w:type="dxa"/>
+            <w:right w:w="108" w:type="dxa"/>
+          </w:tblCellMar>
         </w:tblPrEx>
         <w:tc>
           <w:tcPr>
@@ -39090,7 +39162,6 @@
           <w:tcPr>
             <w:tcW w:w="0" w:type="auto"/>
             <w:vMerge w:val="continue"/>
-            <w:tcBorders/>
             <w:vAlign w:val="center"/>
           </w:tcPr>
           <w:p>
@@ -39193,7 +39264,6 @@
           <w:tcPr>
             <w:tcW w:w="0" w:type="auto"/>
             <w:vMerge w:val="continue"/>
-            <w:tcBorders/>
             <w:vAlign w:val="center"/>
           </w:tcPr>
           <w:p>

</xml_diff>